<commit_message>
docs(project): complete submission templates
</commit_message>
<xml_diff>
--- a/开发者声音VOD建议材料.docx
+++ b/开发者声音VOD建议材料.docx
@@ -34,6 +34,7 @@
         <w:tblStyle w:val="TableGrid"/>
         <w:tblW w:type="auto" w:w="0"/>
         <w:jc w:val="center"/>
+        <w:tblLayout w:type="fixed"/>
         <w:tblLook w:firstColumn="1" w:firstRow="1" w:lastColumn="0" w:lastRow="0" w:noHBand="0" w:noVBand="1" w:val="04A0"/>
       </w:tblPr>
       <w:tblGrid>
@@ -41,23 +42,39 @@
         <w:gridCol w:w="4680"/>
       </w:tblGrid>
       <w:tr>
+        <w:trPr>
+          <w:tblHeader w:val="true"/>
+        </w:trPr>
         <w:tc>
           <w:tcPr>
-            <w:tcW w:type="dxa" w:w="2700"/>
-            <w:shd w:fill="E8EEF5"/>
+            <w:tcW w:type="dxa" w:w="2520"/>
+            <w:shd w:fill="E7EEF5"/>
             <w:vAlign w:val="center"/>
+            <w:tcMar>
+              <w:top w:w="90" w:type="dxa"/>
+              <w:start w:w="110" w:type="dxa"/>
+              <w:bottom w:w="90" w:type="dxa"/>
+              <w:end w:w="110" w:type="dxa"/>
+            </w:tcMar>
           </w:tcPr>
           <w:p>
             <w:pPr>
-              <w:spacing w:after="0"/>
+              <w:spacing w:after="0" w:line="276" w:lineRule="auto"/>
             </w:pPr>
-            <w:r/>
             <w:r>
               <w:rPr>
-                <w:rFonts w:ascii="Calibri" w:hAnsi="Calibri" w:eastAsia="Microsoft YaHei"/>
+                <w:rFonts w:ascii="微软雅黑" w:hAnsi="微软雅黑" w:eastAsia="微软雅黑"/>
                 <w:b/>
-                <w:color w:val="0B2545"/>
-                <w:sz w:val="21"/>
+                <w:color w:val="0D2B4C"/>
+                <w:sz w:val="19"/>
+              </w:rPr>
+            </w:r>
+            <w:r>
+              <w:rPr>
+                <w:rFonts w:ascii="微软雅黑" w:hAnsi="微软雅黑" w:eastAsia="微软雅黑"/>
+                <w:b/>
+                <w:color w:val="0D2B4C"/>
+                <w:sz w:val="19"/>
               </w:rPr>
               <w:t>关联产品</w:t>
             </w:r>
@@ -65,19 +82,32 @@
         </w:tc>
         <w:tc>
           <w:tcPr>
-            <w:tcW w:type="dxa" w:w="6660"/>
+            <w:tcW w:type="dxa" w:w="6264"/>
             <w:vAlign w:val="center"/>
+            <w:tcMar>
+              <w:top w:w="90" w:type="dxa"/>
+              <w:start w:w="110" w:type="dxa"/>
+              <w:bottom w:w="90" w:type="dxa"/>
+              <w:end w:w="110" w:type="dxa"/>
+            </w:tcMar>
+            <w:shd w:fill="D9EAF7"/>
           </w:tcPr>
           <w:p>
             <w:pPr>
-              <w:spacing w:after="0"/>
+              <w:spacing w:after="0" w:line="276" w:lineRule="auto"/>
             </w:pPr>
-            <w:r/>
             <w:r>
               <w:rPr>
-                <w:rFonts w:ascii="Calibri" w:hAnsi="Calibri" w:eastAsia="Microsoft YaHei"/>
-                <w:b w:val="0"/>
-                <w:sz w:val="21"/>
+                <w:rFonts w:ascii="微软雅黑" w:hAnsi="微软雅黑" w:eastAsia="微软雅黑"/>
+                <w:b/>
+                <w:sz w:val="19"/>
+              </w:rPr>
+            </w:r>
+            <w:r>
+              <w:rPr>
+                <w:rFonts w:ascii="微软雅黑" w:hAnsi="微软雅黑" w:eastAsia="微软雅黑"/>
+                <w:b/>
+                <w:sz w:val="19"/>
               </w:rPr>
               <w:t>华为云 Flexus 云服务 / Flexus 应用服务器 L 实例</w:t>
             </w:r>
@@ -87,21 +117,34 @@
       <w:tr>
         <w:tc>
           <w:tcPr>
-            <w:tcW w:type="dxa" w:w="2700"/>
-            <w:shd w:fill="E8EEF5"/>
+            <w:tcW w:type="dxa" w:w="2520"/>
+            <w:shd w:fill="E7EEF5"/>
             <w:vAlign w:val="center"/>
+            <w:tcMar>
+              <w:top w:w="90" w:type="dxa"/>
+              <w:start w:w="110" w:type="dxa"/>
+              <w:bottom w:w="90" w:type="dxa"/>
+              <w:end w:w="110" w:type="dxa"/>
+            </w:tcMar>
           </w:tcPr>
           <w:p>
             <w:pPr>
-              <w:spacing w:after="0"/>
+              <w:spacing w:after="0" w:line="276" w:lineRule="auto"/>
             </w:pPr>
-            <w:r/>
             <w:r>
               <w:rPr>
-                <w:rFonts w:ascii="Calibri" w:hAnsi="Calibri" w:eastAsia="Microsoft YaHei"/>
+                <w:rFonts w:ascii="微软雅黑" w:hAnsi="微软雅黑" w:eastAsia="微软雅黑"/>
                 <w:b/>
-                <w:color w:val="0B2545"/>
-                <w:sz w:val="21"/>
+                <w:color w:val="0D2B4C"/>
+                <w:sz w:val="19"/>
+              </w:rPr>
+            </w:r>
+            <w:r>
+              <w:rPr>
+                <w:rFonts w:ascii="微软雅黑" w:hAnsi="微软雅黑" w:eastAsia="微软雅黑"/>
+                <w:b/>
+                <w:color w:val="0D2B4C"/>
+                <w:sz w:val="19"/>
               </w:rPr>
               <w:t>建议类型</w:t>
             </w:r>
@@ -109,19 +152,30 @@
         </w:tc>
         <w:tc>
           <w:tcPr>
-            <w:tcW w:type="dxa" w:w="6660"/>
+            <w:tcW w:type="dxa" w:w="6264"/>
             <w:vAlign w:val="center"/>
+            <w:tcMar>
+              <w:top w:w="90" w:type="dxa"/>
+              <w:start w:w="110" w:type="dxa"/>
+              <w:bottom w:w="90" w:type="dxa"/>
+              <w:end w:w="110" w:type="dxa"/>
+            </w:tcMar>
           </w:tcPr>
           <w:p>
             <w:pPr>
-              <w:spacing w:after="0"/>
+              <w:spacing w:after="0" w:line="276" w:lineRule="auto"/>
             </w:pPr>
-            <w:r/>
             <w:r>
               <w:rPr>
-                <w:rFonts w:ascii="Calibri" w:hAnsi="Calibri" w:eastAsia="Microsoft YaHei"/>
+                <w:rFonts w:ascii="微软雅黑" w:hAnsi="微软雅黑" w:eastAsia="微软雅黑"/>
+                <w:sz w:val="19"/>
+              </w:rPr>
+            </w:r>
+            <w:r>
+              <w:rPr>
+                <w:rFonts w:ascii="微软雅黑" w:hAnsi="微软雅黑" w:eastAsia="微软雅黑"/>
                 <w:b w:val="0"/>
-                <w:sz w:val="21"/>
+                <w:sz w:val="19"/>
               </w:rPr>
               <w:t>用户体验与功能优化建议</w:t>
             </w:r>
@@ -131,21 +185,34 @@
       <w:tr>
         <w:tc>
           <w:tcPr>
-            <w:tcW w:type="dxa" w:w="2700"/>
-            <w:shd w:fill="E8EEF5"/>
+            <w:tcW w:type="dxa" w:w="2520"/>
+            <w:shd w:fill="E7EEF5"/>
             <w:vAlign w:val="center"/>
+            <w:tcMar>
+              <w:top w:w="90" w:type="dxa"/>
+              <w:start w:w="110" w:type="dxa"/>
+              <w:bottom w:w="90" w:type="dxa"/>
+              <w:end w:w="110" w:type="dxa"/>
+            </w:tcMar>
           </w:tcPr>
           <w:p>
             <w:pPr>
-              <w:spacing w:after="0"/>
+              <w:spacing w:after="0" w:line="276" w:lineRule="auto"/>
             </w:pPr>
-            <w:r/>
             <w:r>
               <w:rPr>
-                <w:rFonts w:ascii="Calibri" w:hAnsi="Calibri" w:eastAsia="Microsoft YaHei"/>
+                <w:rFonts w:ascii="微软雅黑" w:hAnsi="微软雅黑" w:eastAsia="微软雅黑"/>
                 <w:b/>
-                <w:color w:val="0B2545"/>
-                <w:sz w:val="21"/>
+                <w:color w:val="0D2B4C"/>
+                <w:sz w:val="19"/>
+              </w:rPr>
+            </w:r>
+            <w:r>
+              <w:rPr>
+                <w:rFonts w:ascii="微软雅黑" w:hAnsi="微软雅黑" w:eastAsia="微软雅黑"/>
+                <w:b/>
+                <w:color w:val="0D2B4C"/>
+                <w:sz w:val="19"/>
               </w:rPr>
               <w:t>项目名称</w:t>
             </w:r>
@@ -153,19 +220,30 @@
         </w:tc>
         <w:tc>
           <w:tcPr>
-            <w:tcW w:type="dxa" w:w="6660"/>
+            <w:tcW w:type="dxa" w:w="6264"/>
             <w:vAlign w:val="center"/>
+            <w:tcMar>
+              <w:top w:w="90" w:type="dxa"/>
+              <w:start w:w="110" w:type="dxa"/>
+              <w:bottom w:w="90" w:type="dxa"/>
+              <w:end w:w="110" w:type="dxa"/>
+            </w:tcMar>
           </w:tcPr>
           <w:p>
             <w:pPr>
-              <w:spacing w:after="0"/>
+              <w:spacing w:after="0" w:line="276" w:lineRule="auto"/>
             </w:pPr>
-            <w:r/>
             <w:r>
               <w:rPr>
-                <w:rFonts w:ascii="Calibri" w:hAnsi="Calibri" w:eastAsia="Microsoft YaHei"/>
+                <w:rFonts w:ascii="微软雅黑" w:hAnsi="微软雅黑" w:eastAsia="微软雅黑"/>
+                <w:sz w:val="19"/>
+              </w:rPr>
+            </w:r>
+            <w:r>
+              <w:rPr>
+                <w:rFonts w:ascii="微软雅黑" w:hAnsi="微软雅黑" w:eastAsia="微软雅黑"/>
                 <w:b w:val="0"/>
-                <w:sz w:val="21"/>
+                <w:sz w:val="19"/>
               </w:rPr>
               <w:t>开发者留存雷达（Developer Retention Radar）</w:t>
             </w:r>
@@ -175,21 +253,34 @@
       <w:tr>
         <w:tc>
           <w:tcPr>
-            <w:tcW w:type="dxa" w:w="2700"/>
-            <w:shd w:fill="E8EEF5"/>
+            <w:tcW w:type="dxa" w:w="2520"/>
+            <w:shd w:fill="E7EEF5"/>
             <w:vAlign w:val="center"/>
+            <w:tcMar>
+              <w:top w:w="90" w:type="dxa"/>
+              <w:start w:w="110" w:type="dxa"/>
+              <w:bottom w:w="90" w:type="dxa"/>
+              <w:end w:w="110" w:type="dxa"/>
+            </w:tcMar>
           </w:tcPr>
           <w:p>
             <w:pPr>
-              <w:spacing w:after="0"/>
+              <w:spacing w:after="0" w:line="276" w:lineRule="auto"/>
             </w:pPr>
-            <w:r/>
             <w:r>
               <w:rPr>
-                <w:rFonts w:ascii="Calibri" w:hAnsi="Calibri" w:eastAsia="Microsoft YaHei"/>
+                <w:rFonts w:ascii="微软雅黑" w:hAnsi="微软雅黑" w:eastAsia="微软雅黑"/>
                 <w:b/>
-                <w:color w:val="0B2545"/>
-                <w:sz w:val="21"/>
+                <w:color w:val="0D2B4C"/>
+                <w:sz w:val="19"/>
+              </w:rPr>
+            </w:r>
+            <w:r>
+              <w:rPr>
+                <w:rFonts w:ascii="微软雅黑" w:hAnsi="微软雅黑" w:eastAsia="微软雅黑"/>
+                <w:b/>
+                <w:color w:val="0D2B4C"/>
+                <w:sz w:val="19"/>
               </w:rPr>
               <w:t>参赛者</w:t>
             </w:r>
@@ -197,21 +288,134 @@
         </w:tc>
         <w:tc>
           <w:tcPr>
-            <w:tcW w:type="dxa" w:w="6660"/>
+            <w:tcW w:type="dxa" w:w="6264"/>
             <w:vAlign w:val="center"/>
+            <w:tcMar>
+              <w:top w:w="90" w:type="dxa"/>
+              <w:start w:w="110" w:type="dxa"/>
+              <w:bottom w:w="90" w:type="dxa"/>
+              <w:end w:w="110" w:type="dxa"/>
+            </w:tcMar>
           </w:tcPr>
           <w:p>
             <w:pPr>
-              <w:spacing w:after="0"/>
+              <w:spacing w:after="0" w:line="276" w:lineRule="auto"/>
             </w:pPr>
-            <w:r/>
             <w:r>
               <w:rPr>
-                <w:rFonts w:ascii="Calibri" w:hAnsi="Calibri" w:eastAsia="Microsoft YaHei"/>
+                <w:rFonts w:ascii="微软雅黑" w:hAnsi="微软雅黑" w:eastAsia="微软雅黑"/>
+                <w:sz w:val="19"/>
+              </w:rPr>
+            </w:r>
+            <w:r>
+              <w:rPr>
+                <w:rFonts w:ascii="微软雅黑" w:hAnsi="微软雅黑" w:eastAsia="微软雅黑"/>
                 <w:b w:val="0"/>
-                <w:sz w:val="21"/>
+                <w:sz w:val="19"/>
               </w:rPr>
               <w:t>葛禹贡 / 20243121880</w:t>
+            </w:r>
+          </w:p>
+        </w:tc>
+      </w:tr>
+      <w:tr>
+        <w:tc>
+          <w:tcPr>
+            <w:tcW w:type="dxa" w:w="2520"/>
+            <w:tcMar>
+              <w:top w:w="90" w:type="dxa"/>
+              <w:start w:w="110" w:type="dxa"/>
+              <w:bottom w:w="90" w:type="dxa"/>
+              <w:end w:w="110" w:type="dxa"/>
+            </w:tcMar>
+            <w:shd w:fill="E7EEF5"/>
+          </w:tcPr>
+          <w:p>
+            <w:pPr>
+              <w:spacing w:after="0" w:line="276" w:lineRule="auto"/>
+            </w:pPr>
+            <w:r>
+              <w:rPr>
+                <w:rFonts w:ascii="微软雅黑" w:hAnsi="微软雅黑" w:eastAsia="微软雅黑"/>
+                <w:b/>
+                <w:color w:val="0D2B4C"/>
+                <w:sz w:val="19"/>
+              </w:rPr>
+              <w:t>公网地址</w:t>
+            </w:r>
+          </w:p>
+        </w:tc>
+        <w:tc>
+          <w:tcPr>
+            <w:tcW w:type="dxa" w:w="6264"/>
+            <w:tcMar>
+              <w:top w:w="90" w:type="dxa"/>
+              <w:start w:w="110" w:type="dxa"/>
+              <w:bottom w:w="90" w:type="dxa"/>
+              <w:end w:w="110" w:type="dxa"/>
+            </w:tcMar>
+          </w:tcPr>
+          <w:p>
+            <w:pPr>
+              <w:spacing w:after="0" w:line="276" w:lineRule="auto"/>
+            </w:pPr>
+            <w:r>
+              <w:rPr>
+                <w:rFonts w:ascii="微软雅黑" w:hAnsi="微软雅黑" w:eastAsia="微软雅黑"/>
+                <w:sz w:val="19"/>
+              </w:rPr>
+              <w:t>http://123.60.220.148</w:t>
+            </w:r>
+          </w:p>
+        </w:tc>
+      </w:tr>
+      <w:tr>
+        <w:tc>
+          <w:tcPr>
+            <w:tcW w:type="dxa" w:w="2520"/>
+            <w:tcMar>
+              <w:top w:w="90" w:type="dxa"/>
+              <w:start w:w="110" w:type="dxa"/>
+              <w:bottom w:w="90" w:type="dxa"/>
+              <w:end w:w="110" w:type="dxa"/>
+            </w:tcMar>
+            <w:shd w:fill="E7EEF5"/>
+          </w:tcPr>
+          <w:p>
+            <w:pPr>
+              <w:spacing w:after="0" w:line="276" w:lineRule="auto"/>
+            </w:pPr>
+            <w:r>
+              <w:rPr>
+                <w:rFonts w:ascii="微软雅黑" w:hAnsi="微软雅黑" w:eastAsia="微软雅黑"/>
+                <w:b/>
+                <w:color w:val="0D2B4C"/>
+                <w:sz w:val="19"/>
+              </w:rPr>
+              <w:t>代码仓库</w:t>
+            </w:r>
+          </w:p>
+        </w:tc>
+        <w:tc>
+          <w:tcPr>
+            <w:tcW w:type="dxa" w:w="6264"/>
+            <w:tcMar>
+              <w:top w:w="90" w:type="dxa"/>
+              <w:start w:w="110" w:type="dxa"/>
+              <w:bottom w:w="90" w:type="dxa"/>
+              <w:end w:w="110" w:type="dxa"/>
+            </w:tcMar>
+          </w:tcPr>
+          <w:p>
+            <w:pPr>
+              <w:spacing w:after="0" w:line="276" w:lineRule="auto"/>
+            </w:pPr>
+            <w:r>
+              <w:rPr>
+                <w:rFonts w:ascii="微软雅黑" w:hAnsi="微软雅黑" w:eastAsia="微软雅黑"/>
+                <w:sz w:val="19"/>
+              </w:rPr>
+              <w:t>https://atomgit.com/GeYugong/developer-retention-radar</w:t>
             </w:r>
           </w:p>
         </w:tc>
@@ -350,24 +554,174 @@
     </w:p>
     <w:p>
       <w:pPr>
-        <w:spacing w:before="100"/>
+        <w:spacing w:after="200"/>
       </w:pPr>
       <w:r>
         <w:rPr>
-          <w:rFonts w:ascii="Calibri" w:hAnsi="Calibri" w:eastAsia="Microsoft YaHei"/>
+          <w:rFonts w:ascii="微软雅黑" w:hAnsi="微软雅黑" w:eastAsia="微软雅黑"/>
           <w:b/>
-          <w:color w:val="0B2545"/>
-          <w:sz w:val="22"/>
+          <w:color w:val="2779BD"/>
+          <w:sz w:val="32"/>
         </w:rPr>
-        <w:t>公网访问：</w:t>
+        <w:t>五、可直接录制的 VOD 口播稿</w:t>
+      </w:r>
+    </w:p>
+    <w:p>
+      <w:pPr>
+        <w:spacing w:after="200"/>
+      </w:pPr>
+      <w:r>
+        <w:rPr>
+          <w:b/>
+          <w:color w:val="5A6C80"/>
+        </w:rPr>
+        <w:t>建议时长：约 90 秒。录制时同时展示 Flexus 实例、Docker Compose 配置和公网作品页面。</w:t>
+      </w:r>
+    </w:p>
+    <w:p>
+      <w:pPr>
+        <w:spacing w:line="312" w:lineRule="auto" w:after="100"/>
+        <w:ind w:firstLine="440"/>
+      </w:pPr>
+      <w:r>
+        <w:rPr>
+          <w:rFonts w:ascii="微软雅黑" w:hAnsi="微软雅黑" w:eastAsia="微软雅黑"/>
+          <w:sz w:val="21"/>
+        </w:rPr>
+        <w:t>大家好，我是大连理工大学的葛禹贡。在使用华为云 Flexus 应用服务器 L 实例部署开发者留存雷达时，我选择了带 Portainer 的 Docker 可视化镜像，并通过 Docker Compose 将 Web 服务映射到 80 端口。</w:t>
+      </w:r>
+    </w:p>
+    <w:p>
+      <w:pPr>
+        <w:spacing w:line="312" w:lineRule="auto" w:after="100"/>
+        <w:ind w:firstLine="440"/>
+      </w:pPr>
+      <w:r>
+        <w:rPr>
+          <w:rFonts w:ascii="微软雅黑" w:hAnsi="微软雅黑" w:eastAsia="微软雅黑"/>
+          <w:sz w:val="21"/>
+        </w:rPr>
+        <w:t>实际部署过程中，Compose 返回 address already in use。排查后发现宿主机预置的 Nginx 已经占用了 80 端口。对于第一次使用容器镜像的开发者来说，这个现象很容易被误判为 Docker、Compose 或项目配置错误，而且当前购买页和首次登录指引没有提前说明默认端口占用情况。</w:t>
+      </w:r>
+    </w:p>
+    <w:p>
+      <w:pPr>
+        <w:spacing w:line="312" w:lineRule="auto" w:after="100"/>
+        <w:ind w:firstLine="440"/>
+      </w:pPr>
+      <w:r>
+        <w:rPr>
+          <w:rFonts w:ascii="微软雅黑" w:hAnsi="微软雅黑" w:eastAsia="微软雅黑"/>
+          <w:sz w:val="21"/>
+        </w:rPr>
+        <w:t>我建议在 Flexus 镜像购买页、实例首次登录引导和 Portainer 控制台中，直接展示宿主机端口占用清单，并在部署常见 Web 应用前自动检测端口冲突。针对 80 和 443 等常用端口，可以提供明确的释放步骤、推荐映射方案，或者一键释放入口。</w:t>
+      </w:r>
+    </w:p>
+    <w:p>
+      <w:pPr>
+        <w:spacing w:line="312" w:lineRule="auto" w:after="100"/>
+        <w:ind w:firstLine="440"/>
+      </w:pPr>
+      <w:r>
+        <w:rPr>
+          <w:rFonts w:ascii="微软雅黑" w:hAnsi="微软雅黑" w:eastAsia="微软雅黑"/>
+          <w:sz w:val="21"/>
+        </w:rPr>
+        <w:t>这样能够减少新用户从购买实例到完成公网部署的排障时间，降低容器化应用的上手门槛。以上建议来自真实项目部署过程，目前项目已经在该实例上稳定运行，并通过公网完成报名、签到、漏斗统计、作品提交和数据导出验证。谢谢。</w:t>
+      </w:r>
+    </w:p>
+    <w:p>
+      <w:pPr>
+        <w:spacing w:before="120" w:after="140"/>
+      </w:pPr>
+      <w:r>
+        <w:rPr>
+          <w:rFonts w:ascii="微软雅黑" w:hAnsi="微软雅黑" w:eastAsia="微软雅黑"/>
+          <w:b/>
+          <w:color w:val="2779BD"/>
+          <w:sz w:val="28"/>
+        </w:rPr>
+        <w:t>六、提交时建议填写</w:t>
+      </w:r>
+    </w:p>
+    <w:p>
+      <w:pPr>
+        <w:spacing w:after="60"/>
+      </w:pPr>
+      <w:r>
+        <w:rPr>
+          <w:rFonts w:ascii="微软雅黑" w:hAnsi="微软雅黑" w:eastAsia="微软雅黑"/>
+          <w:b/>
+          <w:sz w:val="21"/>
+        </w:rPr>
+        <w:t>标题：</w:t>
       </w:r>
       <w:r>
         <w:rPr>
-          <w:rFonts w:ascii="Calibri" w:hAnsi="Calibri" w:eastAsia="Microsoft YaHei"/>
-          <w:color w:val="2E74B5"/>
-          <w:sz w:val="22"/>
+          <w:rFonts w:ascii="微软雅黑" w:hAnsi="微软雅黑" w:eastAsia="微软雅黑"/>
+          <w:sz w:val="21"/>
         </w:rPr>
-        <w:t>http://123.60.220.148</w:t>
+        <w:t>Flexus 应用服务器 L 实例的默认端口占用缺少前置提示</w:t>
+      </w:r>
+    </w:p>
+    <w:p>
+      <w:pPr>
+        <w:spacing w:after="60"/>
+      </w:pPr>
+      <w:r>
+        <w:rPr>
+          <w:rFonts w:ascii="微软雅黑" w:hAnsi="微软雅黑" w:eastAsia="微软雅黑"/>
+          <w:b/>
+          <w:sz w:val="21"/>
+        </w:rPr>
+        <w:t>关联产品：</w:t>
+      </w:r>
+      <w:r>
+        <w:rPr>
+          <w:rFonts w:ascii="微软雅黑" w:hAnsi="微软雅黑" w:eastAsia="微软雅黑"/>
+          <w:sz w:val="21"/>
+        </w:rPr>
+        <w:t>Flexus 应用服务器 L 实例 / Portainer 镜像</w:t>
+      </w:r>
+    </w:p>
+    <w:p>
+      <w:pPr>
+        <w:spacing w:after="60"/>
+      </w:pPr>
+      <w:r>
+        <w:rPr>
+          <w:rFonts w:ascii="微软雅黑" w:hAnsi="微软雅黑" w:eastAsia="微软雅黑"/>
+          <w:b/>
+          <w:sz w:val="21"/>
+        </w:rPr>
+        <w:t>问题类型：</w:t>
+      </w:r>
+      <w:r>
+        <w:rPr>
+          <w:rFonts w:ascii="微软雅黑" w:hAnsi="微软雅黑" w:eastAsia="微软雅黑"/>
+          <w:sz w:val="21"/>
+        </w:rPr>
+        <w:t>用户体验与功能优化建议</w:t>
+      </w:r>
+    </w:p>
+    <w:p>
+      <w:pPr>
+        <w:spacing w:after="60"/>
+      </w:pPr>
+      <w:r>
+        <w:rPr>
+          <w:rFonts w:ascii="微软雅黑" w:hAnsi="微软雅黑" w:eastAsia="微软雅黑"/>
+          <w:b/>
+          <w:sz w:val="21"/>
+        </w:rPr>
+        <w:t>核心诉求：</w:t>
+      </w:r>
+      <w:r>
+        <w:rPr>
+          <w:rFonts w:ascii="微软雅黑" w:hAnsi="微软雅黑" w:eastAsia="微软雅黑"/>
+          <w:sz w:val="21"/>
+        </w:rPr>
+        <w:t>展示端口占用、部署前冲突检测并提供常用端口释放指引</w:t>
       </w:r>
     </w:p>
     <w:sectPr>

</xml_diff>